<commit_message>
Add technical documentation for Ecommify database design
</commit_message>
<xml_diff>
--- a/docs/Documento_Tecnico_Diseno_BD_Ecommify.docx
+++ b/docs/Documento_Tecnico_Diseno_BD_Ecommify.docx
@@ -135,6 +135,7 @@
     <w:p>
       <w:pPr>
         <w:spacing w:after="240" w:line="480" w:lineRule="auto"/>
+        <w:ind w:left="708" w:hanging="708"/>
         <w:jc w:val="center"/>
       </w:pPr>
       <w:r>
@@ -4755,6 +4756,192 @@
     </w:p>
     <w:p>
       <w:pPr>
+        <w:spacing w:after="120"/>
+      </w:pPr>
+      <w:r>
+        <w:rPr>
+          <w:noProof/>
+        </w:rPr>
+        <w:lastRenderedPageBreak/>
+        <w:drawing>
+          <wp:inline distT="0" distB="0" distL="0" distR="0" wp14:anchorId="564C4688" wp14:editId="473ABE73">
+            <wp:extent cx="5762625" cy="4714875"/>
+            <wp:effectExtent l="0" t="0" r="0" b="0"/>
+            <wp:docPr id="1" name="image1.png"/>
+            <wp:cNvGraphicFramePr/>
+            <a:graphic xmlns:a="http://schemas.openxmlformats.org/drawingml/2006/main">
+              <a:graphicData uri="http://schemas.openxmlformats.org/drawingml/2006/picture">
+                <pic:pic xmlns:pic="http://schemas.openxmlformats.org/drawingml/2006/picture">
+                  <pic:nvPicPr>
+                    <pic:cNvPr id="0" name="image1.png"/>
+                    <pic:cNvPicPr preferRelativeResize="0"/>
+                  </pic:nvPicPr>
+                  <pic:blipFill>
+                    <a:blip r:embed="rId7"/>
+                    <a:srcRect/>
+                    <a:stretch>
+                      <a:fillRect/>
+                    </a:stretch>
+                  </pic:blipFill>
+                  <pic:spPr>
+                    <a:xfrm>
+                      <a:off x="0" y="0"/>
+                      <a:ext cx="5762625" cy="4714875"/>
+                    </a:xfrm>
+                    <a:prstGeom prst="rect">
+                      <a:avLst/>
+                    </a:prstGeom>
+                    <a:ln/>
+                  </pic:spPr>
+                </pic:pic>
+              </a:graphicData>
+            </a:graphic>
+          </wp:inline>
+        </w:drawing>
+      </w:r>
+    </w:p>
+    <w:p>
+      <w:pPr>
+        <w:spacing w:after="120"/>
+        <w:jc w:val="center"/>
+      </w:pPr>
+      <w:r>
+        <w:rPr>
+          <w:color w:val="555555"/>
+          <w:sz w:val="18"/>
+          <w:szCs w:val="18"/>
+        </w:rPr>
+        <w:t xml:space="preserve">Figura 1. Diagrama Entidad-Relación (ER) del sistema </w:t>
+      </w:r>
+      <w:proofErr w:type="spellStart"/>
+      <w:r>
+        <w:rPr>
+          <w:color w:val="555555"/>
+          <w:sz w:val="18"/>
+          <w:szCs w:val="18"/>
+        </w:rPr>
+        <w:t>Ecommify</w:t>
+      </w:r>
+      <w:proofErr w:type="spellEnd"/>
+      <w:r>
+        <w:rPr>
+          <w:color w:val="555555"/>
+          <w:sz w:val="18"/>
+          <w:szCs w:val="18"/>
+        </w:rPr>
+        <w:t xml:space="preserve"> con 9 entidades, </w:t>
+      </w:r>
+      <w:proofErr w:type="spellStart"/>
+      <w:r>
+        <w:rPr>
+          <w:color w:val="555555"/>
+          <w:sz w:val="18"/>
+          <w:szCs w:val="18"/>
+        </w:rPr>
+        <w:t>PKs</w:t>
+      </w:r>
+      <w:proofErr w:type="spellEnd"/>
+      <w:r>
+        <w:rPr>
+          <w:color w:val="555555"/>
+          <w:sz w:val="18"/>
+          <w:szCs w:val="18"/>
+        </w:rPr>
+        <w:t xml:space="preserve">, </w:t>
+      </w:r>
+      <w:proofErr w:type="spellStart"/>
+      <w:r>
+        <w:rPr>
+          <w:color w:val="555555"/>
+          <w:sz w:val="18"/>
+          <w:szCs w:val="18"/>
+        </w:rPr>
+        <w:t>FKs</w:t>
+      </w:r>
+      <w:proofErr w:type="spellEnd"/>
+      <w:r>
+        <w:rPr>
+          <w:color w:val="555555"/>
+          <w:sz w:val="18"/>
+          <w:szCs w:val="18"/>
+        </w:rPr>
+        <w:t xml:space="preserve"> y cardinalidades reales del EDA. Azul = PostgreSQL; Naranja = módulo híbrido MongoDB. (*) REVIEWS usa PK compuesta (</w:t>
+      </w:r>
+      <w:proofErr w:type="spellStart"/>
+      <w:r>
+        <w:rPr>
+          <w:color w:val="555555"/>
+          <w:sz w:val="18"/>
+          <w:szCs w:val="18"/>
+        </w:rPr>
+        <w:t>order_id</w:t>
+      </w:r>
+      <w:proofErr w:type="spellEnd"/>
+      <w:r>
+        <w:rPr>
+          <w:color w:val="555555"/>
+          <w:sz w:val="18"/>
+          <w:szCs w:val="18"/>
+        </w:rPr>
+        <w:t xml:space="preserve">, </w:t>
+      </w:r>
+      <w:proofErr w:type="spellStart"/>
+      <w:r>
+        <w:rPr>
+          <w:color w:val="555555"/>
+          <w:sz w:val="18"/>
+          <w:szCs w:val="18"/>
+        </w:rPr>
+        <w:t>review_id</w:t>
+      </w:r>
+      <w:proofErr w:type="spellEnd"/>
+      <w:r>
+        <w:rPr>
+          <w:color w:val="555555"/>
+          <w:sz w:val="18"/>
+          <w:szCs w:val="18"/>
+        </w:rPr>
+        <w:t xml:space="preserve">) por 814 duplicados detectados en </w:t>
+      </w:r>
+      <w:proofErr w:type="spellStart"/>
+      <w:r>
+        <w:rPr>
+          <w:color w:val="555555"/>
+          <w:sz w:val="18"/>
+          <w:szCs w:val="18"/>
+        </w:rPr>
+        <w:t>review_id</w:t>
+      </w:r>
+      <w:proofErr w:type="spellEnd"/>
+      <w:r>
+        <w:rPr>
+          <w:color w:val="555555"/>
+          <w:sz w:val="18"/>
+          <w:szCs w:val="18"/>
+        </w:rPr>
+        <w:t>.</w:t>
+      </w:r>
+    </w:p>
+    <w:p>
+      <w:pPr>
+        <w:rPr>
+          <w:b/>
+          <w:bCs/>
+          <w:color w:val="1A5276"/>
+          <w:sz w:val="24"/>
+          <w:szCs w:val="24"/>
+        </w:rPr>
+      </w:pPr>
+      <w:r>
+        <w:rPr>
+          <w:sz w:val="24"/>
+          <w:szCs w:val="24"/>
+        </w:rPr>
+        <w:br w:type="page"/>
+      </w:r>
+    </w:p>
+    <w:p>
+      <w:pPr>
         <w:pStyle w:val="Ttulo2"/>
       </w:pPr>
       <w:r>
@@ -4762,6 +4949,7 @@
           <w:sz w:val="24"/>
           <w:szCs w:val="24"/>
         </w:rPr>
+        <w:lastRenderedPageBreak/>
         <w:t>3.2. Relaciones y Cardinalidades</w:t>
       </w:r>
     </w:p>
@@ -4943,7 +5131,6 @@
                 <w:sz w:val="20"/>
                 <w:szCs w:val="20"/>
               </w:rPr>
-              <w:lastRenderedPageBreak/>
               <w:t>Customer</w:t>
             </w:r>
             <w:proofErr w:type="spellEnd"/>
@@ -21648,8 +21835,8 @@
       </w:r>
     </w:p>
     <w:sectPr>
-      <w:headerReference w:type="default" r:id="rId7"/>
-      <w:footerReference w:type="default" r:id="rId8"/>
+      <w:headerReference w:type="default" r:id="rId8"/>
+      <w:footerReference w:type="default" r:id="rId9"/>
       <w:pgSz w:w="12240" w:h="15840"/>
       <w:pgMar w:top="1440" w:right="1440" w:bottom="1440" w:left="1440" w:header="708" w:footer="708" w:gutter="0"/>
       <w:cols w:space="720"/>
@@ -22408,7 +22595,6 @@
   <w:style w:type="character" w:default="1" w:styleId="Fuentedeprrafopredeter">
     <w:name w:val="Default Paragraph Font"/>
     <w:uiPriority w:val="1"/>
-    <w:semiHidden/>
     <w:unhideWhenUsed/>
   </w:style>
   <w:style w:type="table" w:default="1" w:styleId="Tablanormal">

</xml_diff>